<commit_message>
Update data location in TC-super-resolution-user-guide.docx
</commit_message>
<xml_diff>
--- a/TC-super-resolution-user-guide.docx
+++ b/TC-super-resolution-user-guide.docx
@@ -697,6 +697,36 @@
       </w:r>
       <w:r>
         <w:t xml:space="preserve"> (the difference between the reference and source) rather than the absolute values, which improves training convergence.</w:t>
+      </w:r>
+    </w:p>
+    <w:p>
+      <w:pPr>
+        <w:spacing w:after="0" w:line="240" w:lineRule="auto"/>
+      </w:pPr>
+      <w:r>
+        <w:rPr>
+          <w:b/>
+          <w:bCs/>
+        </w:rPr>
+        <w:t>Note:</w:t>
+      </w:r>
+      <w:r>
+        <w:t xml:space="preserve"> </w:t>
+      </w:r>
+      <w:r>
+        <w:t>Because of the large file sizes, the data is archived on our FTP si</w:t>
+      </w:r>
+      <w:r>
+        <w:t>te (</w:t>
+      </w:r>
+      <w:r>
+        <w:t>https://lswg.uncw.edu/data/data-yalei/share-GRL-paper-data/</w:t>
+      </w:r>
+      <w:r>
+        <w:t>)</w:t>
+      </w:r>
+      <w:r>
+        <w:t>, while this GitHub repository contains the source code.</w:t>
       </w:r>
     </w:p>
     <w:p>
@@ -1934,7 +1964,6 @@
   <w:style w:type="character" w:default="1" w:styleId="DefaultParagraphFont">
     <w:name w:val="Default Paragraph Font"/>
     <w:uiPriority w:val="1"/>
-    <w:semiHidden/>
     <w:unhideWhenUsed/>
   </w:style>
   <w:style w:type="table" w:default="1" w:styleId="TableNormal">
@@ -2265,6 +2294,29 @@
     <w:uiPriority w:val="99"/>
     <w:semiHidden/>
     <w:rsid w:val="00BA678B"/>
+  </w:style>
+  <w:style w:type="character" w:styleId="Hyperlink">
+    <w:name w:val="Hyperlink"/>
+    <w:basedOn w:val="DefaultParagraphFont"/>
+    <w:uiPriority w:val="99"/>
+    <w:unhideWhenUsed/>
+    <w:rsid w:val="00347680"/>
+    <w:rPr>
+      <w:color w:val="467886" w:themeColor="hyperlink"/>
+      <w:u w:val="single"/>
+    </w:rPr>
+  </w:style>
+  <w:style w:type="character" w:styleId="UnresolvedMention">
+    <w:name w:val="Unresolved Mention"/>
+    <w:basedOn w:val="DefaultParagraphFont"/>
+    <w:uiPriority w:val="99"/>
+    <w:semiHidden/>
+    <w:unhideWhenUsed/>
+    <w:rsid w:val="00347680"/>
+    <w:rPr>
+      <w:color w:val="605E5C"/>
+      <w:shd w:val="clear" w:color="auto" w:fill="E1DFDD"/>
+    </w:rPr>
   </w:style>
 </w:styles>
 </file>

</xml_diff>